<commit_message>
feat(ba-kit): O4 Design System đúng format Artifact type "Design System" của claude.ai
O4 trước dùng format markdown của designer-kit, không khớp yêu cầu. Nay O4 là
project/ đúng cấu trúc type Design System: design-system.json (index v3),
tokens.json dạng list theo theme, README brand book, component README +
preview.html + bundle.js/css + index.d.ts, Cover, assets Logos/Icons.

- crawl-site thu thêm style component, thang chữ, shadow/radius, logo + icon SVG
- extract-design-tokens --emit-tokens sinh tokens.json khởi đầu chỉ từ giá trị
  quan sát được (tên obs-/usage TODO buộc agent đặt tên + ghi chú)
- verify-design-system viết lại theo ngữ pháp format.md + selftest 24 ca
- P7b hỏi publish artifact private; Luồng 2 tham chiếu DS:<token>, DS-component:<Comp>
- đã publish thử bản ShopDemo: index.d.ts phải gửi contentType text/plain

Co-Authored-By: Claude Opus 5.5 <noreply@anthropic.com>
</commit_message>
<xml_diff>
--- a/ba-kit/system-to-doc/docs/Hướng dẫn sử dụng System to Doc.docx
+++ b/ba-kit/system-to-doc/docs/Hướng dẫn sử dụng System to Doc.docx
@@ -371,7 +371,7 @@
           </w:tcPr>
           <w:p>
             <w:r>
-              <w:t>Link design hiện tại; link file để AI vẽ flow</w:t>
+              <w:t>Link design hiện tại; link file để AI vẽ flow; có publish Design System lên claude.ai không</w:t>
             </w:r>
           </w:p>
         </w:tc>
@@ -750,7 +750,7 @@
           </w:tcPr>
           <w:p>
             <w:r>
-              <w:t>Màu, font, khoảng cách, component hệ thống đang dùng — dùng lại khi làm màn mới</w:t>
+              <w:t>Đúng format artifact Design System của claude.ai: brand book, màu theo theme, thang chữ, spacing/bo góc/đổ bóng, component có preview chạy thật, logo/icon. Đồng ý thì AI publish thành link private — dùng lại khi làm màn mới</w:t>
             </w:r>
           </w:p>
         </w:tc>

</xml_diff>

<commit_message>
feat(ba-kit): CR Impact 2 sheet có MD + giải trình CR, Figma CR có IMPACT, DS tách theo website
Theo feedback review Luồng 2 và Design System:

- CR-<id>_Impact.xlsx chỉ còn 2 sheet: Summary (vì sao là CR theo tiêu chí
  C1–C6 có trích baseline, tổng MD trục × loại, câu hỏi) và Impact (từng hạng
  mục: NEW/UPD/DEL/IMPACT, vì sao phải sửa, MD). Bỏ CR-<id>_Summary.md.
- MD = đơn giá × số lượng do build-cr-impact tính từ md-unit-rates.json
  (DRAFT, chờ PM duyệt); AI chỉ chọn mã đơn giá, gate chặn MD sửa tay.
- Figma CR thêm badge IMPACT cho phần bị kéo theo; verify-cr-figma chặn node
  ngoài phạm vi (không phải hạng mục Impact / hàng xóm 1 bước), badge sai loại.
- Design System tự quyết theo dữ liệu: các site chỉ khác màu → 1 DS nhiều
  theme; khác cả font / thang chữ / bo góc / control → 1 DS mỗi website
  (04_DesignSystem/WEB-xx/), --force-mode để user quyết khác.
- version-tool đọc mã CR + baseline từ _internal/cr.json.

Co-Authored-By: Claude Opus 5.5 <noreply@anthropic.com>
</commit_message>
<xml_diff>
--- a/ba-kit/system-to-doc/docs/Hướng dẫn sử dụng System to Doc.docx
+++ b/ba-kit/system-to-doc/docs/Hướng dẫn sử dụng System to Doc.docx
@@ -1181,7 +1181,7 @@
         <w:pStyle w:val="ListBullet"/>
       </w:pPr>
       <w:r>
-        <w:t>CR-&lt;id&gt;_Impact.xlsx — chi tiết từng trục, xung đột, mức rủi ro, câu hỏi cần khách trả lời.</w:t>
+        <w:t>CR-&lt;id&gt;_Impact.xlsx — sheet Impact: từng hạng mục (thêm / sửa / xoá / bị ảnh hưởng), vì sao phải sửa, xung đột, rủi ro, MD.</w:t>
       </w:r>
     </w:p>
     <w:p>
@@ -1189,7 +1189,7 @@
         <w:pStyle w:val="ListBullet"/>
       </w:pPr>
       <w:r>
-        <w:t>CR-&lt;id&gt;_Summary.md — tóm tắt ≤ 1 trang, gửi khách được.</w:t>
+        <w:t>Sheet Summary: vì sao đây là CR (đối chiếu hệ thống hiện tại) + tổng MD — gửi khách được.</w:t>
       </w:r>
     </w:p>
     <w:p>
@@ -1197,7 +1197,7 @@
         <w:pStyle w:val="ListBullet"/>
       </w:pPr>
       <w:r>
-        <w:t>Figma — 1 view CR MỚI, chỉ vẽ phần thay đổi và phần bị ảnh hưởng; bản cũ giữ nguyên.</w:t>
+        <w:t>Figma — 1 view CR MỚI, chỉ vẽ phần thay đổi và phần bị ảnh hưởng (tô màu theo loại); bản cũ giữ nguyên.</w:t>
       </w:r>
     </w:p>
     <w:p>

</xml_diff>

<commit_message>
feat(ba-kit): system-to-doc tự quản version — mỗi lần chạy agent tự đọc version mới nhất
- version-tool.py context: version mới nhất · baseline mới nhất · CR mở (mỗi CR 1 bản mới nhất) · feedback chưa xử lý · mode đề xuất · file cần đọc; chạy lại CR → bản mới nhất của CR đó, cảnh báo khi bản cũ dùng baseline khác
- Luồng 1 / Luồng 2 gọi context ở đầu mọi lần chạy; G-R đề xuất Delta khi còn CR mở / feedback, hỏi CR nào đã code xong
- Góp ý nói trong chat → agent tạo version mới từ bản mới nhất, ghi mục "Feedback đã xử lý" trong run-log
- README + hướng dẫn .docx: Bước 8 thành "AI tự làm"; build lại ảnh Luồng 2 (7 sheet)

Co-Authored-By: Claude Opus 5.5 <noreply@anthropic.com>
</commit_message>
<xml_diff>
--- a/ba-kit/system-to-doc/docs/Hướng dẫn sử dụng System to Doc.docx
+++ b/ba-kit/system-to-doc/docs/Hướng dẫn sử dụng System to Doc.docx
@@ -1388,7 +1388,7 @@
               <w:rPr>
                 <w:sz w:val="19"/>
               </w:rPr>
-              <w:t>xlsx (2 sheet) + link Figma view CR</w:t>
+              <w:t>xlsx (7 sheet) + link Figma view CR</w:t>
             </w:r>
           </w:p>
         </w:tc>
@@ -2225,7 +2225,7 @@
         <w:pStyle w:val="Heading3"/>
       </w:pPr>
       <w:r>
-        <w:t>CR-&lt;id&gt;_Impact.xlsx — 2 sheet</w:t>
+        <w:t>CR-&lt;id&gt;_Impact.xlsx — 7 sheet</w:t>
       </w:r>
     </w:p>
     <w:p>
@@ -2239,7 +2239,7 @@
         <w:t>Summary</w:t>
       </w:r>
       <w:r>
-        <w:t xml:space="preserve"> — vì sao đây là CR (đối chiếu hệ thống hiện tại) · tổng MD theo Trục × Loại · câu hỏi cần khách trả lời. Gửi khách được.</w:t>
+        <w:t xml:space="preserve"> — công số thay đổi (実装 MD · 総工数 人日 · 人月, link sang Estimation) · số màn / API / bảng DB … thêm / sửa / xoá / bị ảnh hưởng · link tới từng sheet.</w:t>
       </w:r>
     </w:p>
     <w:p>
@@ -2250,10 +2250,38 @@
         <w:rPr>
           <w:b/>
         </w:rPr>
-        <w:t>Impact</w:t>
+        <w:t>Estimation</w:t>
       </w:r>
       <w:r>
-        <w:t xml:space="preserve"> — từng hạng mục: thêm / sửa / xoá / bị ảnh hưởng, vì sao phải sửa, xung đột, rủi ro, MD.</w:t>
+        <w:t xml:space="preserve"> — đúng khung 見積書 của công ty (templates/template_estimation.xlsx), 1 dòng / hạng mục.</w:t>
+      </w:r>
+    </w:p>
+    <w:p>
+      <w:pPr>
+        <w:pStyle w:val="ListBullet"/>
+      </w:pPr>
+      <w:r>
+        <w:rPr>
+          <w:b/>
+        </w:rPr>
+        <w:t>Screen · API · Database · Figma</w:t>
+      </w:r>
+      <w:r>
+        <w:t xml:space="preserve"> — từng hạng mục của trục: vì sao phải sửa, xung đột, rủi ro, MD.</w:t>
+      </w:r>
+    </w:p>
+    <w:p>
+      <w:pPr>
+        <w:pStyle w:val="ListBullet"/>
+      </w:pPr>
+      <w:r>
+        <w:rPr>
+          <w:b/>
+        </w:rPr>
+        <w:t>Q&amp;A</w:t>
+      </w:r>
+      <w:r>
+        <w:t xml:space="preserve"> — vì sao đây là CR · câu hỏi cần khách trả lời · mục không thuộc CR.</w:t>
       </w:r>
     </w:p>
     <w:p>
@@ -2339,7 +2367,23 @@
         <w:pStyle w:val="ListBullet"/>
       </w:pPr>
       <w:r>
-        <w:t>Chỉ vẽ phần thay đổi + phần bị ảnh hưởng + màn bên cạnh 1 bước; tô màu theo badge, kèm CR Change Table.</w:t>
+        <w:t>CR-1 Flow theo khung Output 1, CR-2 Screen Flow theo khung Output 2 (mũi tên thật); chỉ phần thay đổi + phần bị ảnh hưởng + màn bên cạnh 1 bước; tô màu theo badge.</w:t>
+      </w:r>
+    </w:p>
+    <w:p>
+      <w:pPr>
+        <w:pStyle w:val="ListBullet"/>
+      </w:pPr>
+      <w:r>
+        <w:t>CR Change Table = thống kê số màn / API / bảng thay đổi + công số (không liệt kê chi tiết).</w:t>
+      </w:r>
+    </w:p>
+    <w:p>
+      <w:pPr>
+        <w:pStyle w:val="ListBullet"/>
+      </w:pPr>
+      <w:r>
+        <w:t>CR-3 màn đề xuất dựng từ Design System của baseline — AI đọc Design System trước, hỏi phạm vi.</w:t>
       </w:r>
     </w:p>
     <w:p>
@@ -2449,7 +2493,12 @@
         <w:pStyle w:val="Heading1"/>
       </w:pPr>
       <w:r>
-        <w:t>BƯỚC 8 — VERSION VÀ CHẠY LẠI</w:t>
+        <w:t>BƯỚC 8 — VERSION VÀ CHẠY LẠI (AI TỰ LÀM)</w:t>
+      </w:r>
+    </w:p>
+    <w:p>
+      <w:r>
+        <w:t>Bạn không phải chỉ version, không phải mở run-log.md. AI tự quản lý version:</w:t>
       </w:r>
     </w:p>
     <w:p>
@@ -2457,7 +2506,7 @@
         <w:pStyle w:val="ListBullet"/>
       </w:pPr>
       <w:r>
-        <w:t>Mỗi lần chạy = 1 folder mới ver&lt;N&gt;_&lt;ngày&gt;_&lt;tên&gt;. Không bao giờ sửa folder cũ.</w:t>
+        <w:t>Mỗi lần chạy, AI tự đọc version mới nhất: baseline mới nhất, CR đang mở, góp ý chưa xử lý.</w:t>
       </w:r>
     </w:p>
     <w:p>
@@ -2465,7 +2514,7 @@
         <w:pStyle w:val="ListBullet"/>
       </w:pPr>
       <w:r>
-        <w:t>Muốn góp ý: ghi vào mục Feedback trong run-log.md của version rồi chạy lại.</w:t>
+        <w:t>Mỗi lần chạy = 1 folder mới ver&lt;N&gt;_&lt;ngày&gt;_&lt;tên&gt;, AI tự đặt tên. Không bao giờ sửa folder cũ.</w:t>
       </w:r>
     </w:p>
     <w:p>
@@ -2473,7 +2522,15 @@
         <w:pStyle w:val="ListBullet"/>
       </w:pPr>
       <w:r>
-        <w:t>CR đã code xong → /analyze-system chọn Delta để có baseline mới cho các CR sau.</w:t>
+        <w:t>Muốn góp ý: nói thẳng trong chat (VD "MD màn coupon cao quá"). AI tạo version mới từ bản mới nhất, sửa và ghi góp ý vào run-log.md.</w:t>
+      </w:r>
+    </w:p>
+    <w:p>
+      <w:pPr>
+        <w:pStyle w:val="ListBullet"/>
+      </w:pPr>
+      <w:r>
+        <w:t>CR đã code xong: chạy /analyze-system (hoặc nói "CR-001 đã code xong") — AI thấy CR đang mở, đề xuất Delta để có baseline mới cho các CR sau.</w:t>
       </w:r>
     </w:p>
     <w:p>

</xml_diff>

<commit_message>
feat(ba-kit): system-to-doc tự quản version — mỗi lần chạy agent tự đọc version mới nhất (#58)
- version-tool.py context: version mới nhất · baseline mới nhất · CR mở (mỗi CR 1 bản mới nhất) · feedback chưa xử lý · mode đề xuất · file cần đọc; chạy lại CR → bản mới nhất của CR đó, cảnh báo khi bản cũ dùng baseline khác
- Luồng 1 / Luồng 2 gọi context ở đầu mọi lần chạy; G-R đề xuất Delta khi còn CR mở / feedback, hỏi CR nào đã code xong
- Góp ý nói trong chat → agent tạo version mới từ bản mới nhất, ghi mục "Feedback đã xử lý" trong run-log
- README + hướng dẫn .docx: Bước 8 thành "AI tự làm"; build lại ảnh Luồng 2 (7 sheet)

Co-authored-by: Claude Opus 5.5 <noreply@anthropic.com>
</commit_message>
<xml_diff>
--- a/ba-kit/system-to-doc/docs/Hướng dẫn sử dụng System to Doc.docx
+++ b/ba-kit/system-to-doc/docs/Hướng dẫn sử dụng System to Doc.docx
@@ -1388,7 +1388,7 @@
               <w:rPr>
                 <w:sz w:val="19"/>
               </w:rPr>
-              <w:t>xlsx (2 sheet) + link Figma view CR</w:t>
+              <w:t>xlsx (7 sheet) + link Figma view CR</w:t>
             </w:r>
           </w:p>
         </w:tc>
@@ -2225,7 +2225,7 @@
         <w:pStyle w:val="Heading3"/>
       </w:pPr>
       <w:r>
-        <w:t>CR-&lt;id&gt;_Impact.xlsx — 2 sheet</w:t>
+        <w:t>CR-&lt;id&gt;_Impact.xlsx — 7 sheet</w:t>
       </w:r>
     </w:p>
     <w:p>
@@ -2239,7 +2239,7 @@
         <w:t>Summary</w:t>
       </w:r>
       <w:r>
-        <w:t xml:space="preserve"> — vì sao đây là CR (đối chiếu hệ thống hiện tại) · tổng MD theo Trục × Loại · câu hỏi cần khách trả lời. Gửi khách được.</w:t>
+        <w:t xml:space="preserve"> — công số thay đổi (実装 MD · 総工数 人日 · 人月, link sang Estimation) · số màn / API / bảng DB … thêm / sửa / xoá / bị ảnh hưởng · link tới từng sheet.</w:t>
       </w:r>
     </w:p>
     <w:p>
@@ -2250,10 +2250,38 @@
         <w:rPr>
           <w:b/>
         </w:rPr>
-        <w:t>Impact</w:t>
+        <w:t>Estimation</w:t>
       </w:r>
       <w:r>
-        <w:t xml:space="preserve"> — từng hạng mục: thêm / sửa / xoá / bị ảnh hưởng, vì sao phải sửa, xung đột, rủi ro, MD.</w:t>
+        <w:t xml:space="preserve"> — đúng khung 見積書 của công ty (templates/template_estimation.xlsx), 1 dòng / hạng mục.</w:t>
+      </w:r>
+    </w:p>
+    <w:p>
+      <w:pPr>
+        <w:pStyle w:val="ListBullet"/>
+      </w:pPr>
+      <w:r>
+        <w:rPr>
+          <w:b/>
+        </w:rPr>
+        <w:t>Screen · API · Database · Figma</w:t>
+      </w:r>
+      <w:r>
+        <w:t xml:space="preserve"> — từng hạng mục của trục: vì sao phải sửa, xung đột, rủi ro, MD.</w:t>
+      </w:r>
+    </w:p>
+    <w:p>
+      <w:pPr>
+        <w:pStyle w:val="ListBullet"/>
+      </w:pPr>
+      <w:r>
+        <w:rPr>
+          <w:b/>
+        </w:rPr>
+        <w:t>Q&amp;A</w:t>
+      </w:r>
+      <w:r>
+        <w:t xml:space="preserve"> — vì sao đây là CR · câu hỏi cần khách trả lời · mục không thuộc CR.</w:t>
       </w:r>
     </w:p>
     <w:p>
@@ -2339,7 +2367,23 @@
         <w:pStyle w:val="ListBullet"/>
       </w:pPr>
       <w:r>
-        <w:t>Chỉ vẽ phần thay đổi + phần bị ảnh hưởng + màn bên cạnh 1 bước; tô màu theo badge, kèm CR Change Table.</w:t>
+        <w:t>CR-1 Flow theo khung Output 1, CR-2 Screen Flow theo khung Output 2 (mũi tên thật); chỉ phần thay đổi + phần bị ảnh hưởng + màn bên cạnh 1 bước; tô màu theo badge.</w:t>
+      </w:r>
+    </w:p>
+    <w:p>
+      <w:pPr>
+        <w:pStyle w:val="ListBullet"/>
+      </w:pPr>
+      <w:r>
+        <w:t>CR Change Table = thống kê số màn / API / bảng thay đổi + công số (không liệt kê chi tiết).</w:t>
+      </w:r>
+    </w:p>
+    <w:p>
+      <w:pPr>
+        <w:pStyle w:val="ListBullet"/>
+      </w:pPr>
+      <w:r>
+        <w:t>CR-3 màn đề xuất dựng từ Design System của baseline — AI đọc Design System trước, hỏi phạm vi.</w:t>
       </w:r>
     </w:p>
     <w:p>
@@ -2449,7 +2493,12 @@
         <w:pStyle w:val="Heading1"/>
       </w:pPr>
       <w:r>
-        <w:t>BƯỚC 8 — VERSION VÀ CHẠY LẠI</w:t>
+        <w:t>BƯỚC 8 — VERSION VÀ CHẠY LẠI (AI TỰ LÀM)</w:t>
+      </w:r>
+    </w:p>
+    <w:p>
+      <w:r>
+        <w:t>Bạn không phải chỉ version, không phải mở run-log.md. AI tự quản lý version:</w:t>
       </w:r>
     </w:p>
     <w:p>
@@ -2457,7 +2506,7 @@
         <w:pStyle w:val="ListBullet"/>
       </w:pPr>
       <w:r>
-        <w:t>Mỗi lần chạy = 1 folder mới ver&lt;N&gt;_&lt;ngày&gt;_&lt;tên&gt;. Không bao giờ sửa folder cũ.</w:t>
+        <w:t>Mỗi lần chạy, AI tự đọc version mới nhất: baseline mới nhất, CR đang mở, góp ý chưa xử lý.</w:t>
       </w:r>
     </w:p>
     <w:p>
@@ -2465,7 +2514,7 @@
         <w:pStyle w:val="ListBullet"/>
       </w:pPr>
       <w:r>
-        <w:t>Muốn góp ý: ghi vào mục Feedback trong run-log.md của version rồi chạy lại.</w:t>
+        <w:t>Mỗi lần chạy = 1 folder mới ver&lt;N&gt;_&lt;ngày&gt;_&lt;tên&gt;, AI tự đặt tên. Không bao giờ sửa folder cũ.</w:t>
       </w:r>
     </w:p>
     <w:p>
@@ -2473,7 +2522,15 @@
         <w:pStyle w:val="ListBullet"/>
       </w:pPr>
       <w:r>
-        <w:t>CR đã code xong → /analyze-system chọn Delta để có baseline mới cho các CR sau.</w:t>
+        <w:t>Muốn góp ý: nói thẳng trong chat (VD "MD màn coupon cao quá"). AI tạo version mới từ bản mới nhất, sửa và ghi góp ý vào run-log.md.</w:t>
+      </w:r>
+    </w:p>
+    <w:p>
+      <w:pPr>
+        <w:pStyle w:val="ListBullet"/>
+      </w:pPr>
+      <w:r>
+        <w:t>CR đã code xong: chạy /analyze-system (hoặc nói "CR-001 đã code xong") — AI thấy CR đang mở, đề xuất Delta để có baseline mới cho các CR sau.</w:t>
       </w:r>
     </w:p>
     <w:p>

</xml_diff>

<commit_message>
feat(designer-kit,ba-kit): đổi prototype-to-figma → document-to-figma; system-to-doc có sẵn inputs/ và .auth/
designer-kit:
- Đổi tên kit prototype-to-figma → document-to-figma (folder, lệnh /document-to-figma, ảnh, docx)
- Đầu vào mở rộng: prototype HTML · SPEC · Basic Design · ảnh · link Figma wireframe
- prototype-intake.md → document-intake.md; vá chữ trong các ảnh hướng dẫn và docx

ba-kit/system-to-doc:
- Có sẵn inputs/{repo,db,cr}/ và .auth/ (credentials.example.env), mỗi folder có README
- Agent tự Glob inputs/repo, inputs/db trước khi hỏi đường dẫn
- .gitignore nội dung inputs/ và .auth/; cập nhật README, AGENTS, docx hướng dẫn
- Trỏ tham chiếu designer-kit sang tên mới

Co-Authored-By: Claude Sonnet 5.5 <noreply@anthropic.com>
</commit_message>
<xml_diff>
--- a/ba-kit/system-to-doc/docs/Hướng dẫn sử dụng System to Doc.docx
+++ b/ba-kit/system-to-doc/docs/Hướng dẫn sử dụng System to Doc.docx
@@ -130,11 +130,173 @@
       </w:r>
     </w:p>
     <w:p>
-      <w:pPr>
-        <w:pStyle w:val="ListBullet"/>
-      </w:pPr>
       <w:r>
-        <w:t>Tạo thêm inputs/db/ (nếu có file schema) và inputs/cr/ (để bỏ yêu cầu thay đổi sau này).</w:t>
+        <w:t>Kit đã có sẵn các folder để bỏ file vào (mỗi folder có README.md hướng dẫn riêng):</w:t>
+      </w:r>
+    </w:p>
+    <w:tbl>
+      <w:tblPr>
+        <w:tblStyle w:val="TableGrid"/>
+        <w:tblW w:type="auto" w:w="0"/>
+        <w:tblLook w:firstColumn="1" w:firstRow="1" w:lastColumn="0" w:lastRow="0" w:noHBand="0" w:noVBand="1" w:val="04A0"/>
+      </w:tblPr>
+      <w:tblGrid>
+        <w:gridCol w:w="4986"/>
+        <w:gridCol w:w="4986"/>
+      </w:tblGrid>
+      <w:tr>
+        <w:tc>
+          <w:tcPr>
+            <w:tcW w:type="dxa" w:w="4986"/>
+          </w:tcPr>
+          <w:p>
+            <w:r>
+              <w:rPr>
+                <w:b/>
+                <w:sz w:val="19"/>
+              </w:rPr>
+              <w:t>Folder</w:t>
+            </w:r>
+          </w:p>
+        </w:tc>
+        <w:tc>
+          <w:tcPr>
+            <w:tcW w:type="dxa" w:w="4986"/>
+          </w:tcPr>
+          <w:p>
+            <w:r>
+              <w:rPr>
+                <w:b/>
+                <w:sz w:val="19"/>
+              </w:rPr>
+              <w:t>Bỏ gì vào</w:t>
+            </w:r>
+          </w:p>
+        </w:tc>
+      </w:tr>
+      <w:tr>
+        <w:tc>
+          <w:tcPr>
+            <w:tcW w:type="dxa" w:w="4986"/>
+          </w:tcPr>
+          <w:p>
+            <w:r>
+              <w:rPr>
+                <w:sz w:val="19"/>
+              </w:rPr>
+              <w:t>inputs/repo/</w:t>
+            </w:r>
+          </w:p>
+        </w:tc>
+        <w:tc>
+          <w:tcPr>
+            <w:tcW w:type="dxa" w:w="4986"/>
+          </w:tcPr>
+          <w:p>
+            <w:r>
+              <w:rPr>
+                <w:sz w:val="19"/>
+              </w:rPr>
+              <w:t>Source code hệ thống — mỗi repo 1 folder con (web-fe/, api/, batch/…). Không bỏ .env, key, node_modules.</w:t>
+            </w:r>
+          </w:p>
+        </w:tc>
+      </w:tr>
+      <w:tr>
+        <w:tc>
+          <w:tcPr>
+            <w:tcW w:type="dxa" w:w="4986"/>
+          </w:tcPr>
+          <w:p>
+            <w:r>
+              <w:rPr>
+                <w:sz w:val="19"/>
+              </w:rPr>
+              <w:t>inputs/db/</w:t>
+            </w:r>
+          </w:p>
+        </w:tc>
+        <w:tc>
+          <w:tcPr>
+            <w:tcW w:type="dxa" w:w="4986"/>
+          </w:tcPr>
+          <w:p>
+            <w:r>
+              <w:rPr>
+                <w:sz w:val="19"/>
+              </w:rPr>
+              <w:t>File schema.sql CHỈ cấu trúc (mysqldump --no-data / pg_dump --schema-only).</w:t>
+            </w:r>
+          </w:p>
+        </w:tc>
+      </w:tr>
+      <w:tr>
+        <w:tc>
+          <w:tcPr>
+            <w:tcW w:type="dxa" w:w="4986"/>
+          </w:tcPr>
+          <w:p>
+            <w:r>
+              <w:rPr>
+                <w:sz w:val="19"/>
+              </w:rPr>
+              <w:t>inputs/cr/</w:t>
+            </w:r>
+          </w:p>
+        </w:tc>
+        <w:tc>
+          <w:tcPr>
+            <w:tcW w:type="dxa" w:w="4986"/>
+          </w:tcPr>
+          <w:p>
+            <w:r>
+              <w:rPr>
+                <w:sz w:val="19"/>
+              </w:rPr>
+              <w:t>File yêu cầu thay đổi của khách (.docx .pdf .xlsx .md, ảnh) — dùng ở Luồng 2.</w:t>
+            </w:r>
+          </w:p>
+        </w:tc>
+      </w:tr>
+      <w:tr>
+        <w:tc>
+          <w:tcPr>
+            <w:tcW w:type="dxa" w:w="4986"/>
+          </w:tcPr>
+          <w:p>
+            <w:r>
+              <w:rPr>
+                <w:sz w:val="19"/>
+              </w:rPr>
+              <w:t>.auth/credentials.local.env</w:t>
+            </w:r>
+          </w:p>
+        </w:tc>
+        <w:tc>
+          <w:tcPr>
+            <w:tcW w:type="dxa" w:w="4986"/>
+          </w:tcPr>
+          <w:p>
+            <w:r>
+              <w:rPr>
+                <w:sz w:val="19"/>
+              </w:rPr>
+              <w:t>Tài khoản test website: copy từ .auth/credentials.example.env rồi điền (xem Bước 3).</w:t>
+            </w:r>
+          </w:p>
+        </w:tc>
+      </w:tr>
+    </w:tbl>
+    <w:p/>
+    <w:p>
+      <w:r>
+        <w:rPr>
+          <w:b/>
+        </w:rPr>
+        <w:t xml:space="preserve">Lưu ý: </w:t>
+      </w:r>
+      <w:r>
+        <w:t>Folder inputs/ và .auth/ đã được .gitignore — file bạn bỏ vào không bị commit. Có folder nào để trống, AI hỏi đường dẫn khác ở bước 2.</w:t>
       </w:r>
     </w:p>
     <w:p>
@@ -206,7 +368,7 @@
       <w:r>
         <w:drawing>
           <wp:inline xmlns:a="http://schemas.openxmlformats.org/drawingml/2006/main" xmlns:pic="http://schemas.openxmlformats.org/drawingml/2006/picture">
-            <wp:extent cx="4680000" cy="2652735"/>
+            <wp:extent cx="4680000" cy="2956848"/>
             <wp:docPr id="3" name="Picture 3"/>
             <wp:cNvGraphicFramePr>
               <a:graphicFrameLocks noChangeAspect="1"/>
@@ -227,7 +389,7 @@
                   <pic:spPr>
                     <a:xfrm>
                       <a:off x="0" y="0"/>
-                      <a:ext cx="4680000" cy="2652735"/>
+                      <a:ext cx="4680000" cy="2956848"/>
                     </a:xfrm>
                     <a:prstGeom prst="rect"/>
                   </pic:spPr>
@@ -555,7 +717,7 @@
               <w:rPr>
                 <w:sz w:val="19"/>
               </w:rPr>
-              <w:t>Số repo, đường dẫn, FE hay BE, repo FE thuộc website nào</w:t>
+              <w:t>Repo nào (AI tự liệt kê từ inputs/repo/), FE hay BE, repo FE thuộc website nào</w:t>
             </w:r>
           </w:p>
         </w:tc>
@@ -568,7 +730,7 @@
               <w:rPr>
                 <w:sz w:val="19"/>
               </w:rPr>
-              <w:t>Đường dẫn repo trên máy</w:t>
+              <w:t>Repo đã bỏ vào inputs/repo/</w:t>
             </w:r>
           </w:p>
         </w:tc>
@@ -609,7 +771,7 @@
               <w:rPr>
                 <w:sz w:val="19"/>
               </w:rPr>
-              <w:t>mysqldump --no-data hoặc pg_dump --schema-only</w:t>
+              <w:t>File .sql chỉ cấu trúc trong inputs/db/ (mysqldump --no-data / pg_dump --schema-only)</w:t>
             </w:r>
           </w:p>
         </w:tc>
@@ -783,7 +945,7 @@
         <w:t>Môi trường TEST</w:t>
       </w:r>
       <w:r>
-        <w:t xml:space="preserve"> — AI tạo file .auth/credentials.local.env có sẵn chỗ trống → bạn mở file, điền tài khoản (+ Basic Auth nếu có), ghi ENV=TEST, lưu rồi trả lời "xong".</w:t>
+        <w:t xml:space="preserve"> — điền sẵn file .auth/credentials.local.env (copy từ credentials.example.env; chưa có thì AI tạo với chỗ trống) → bạn mở file, điền URL, tài khoản (+ Basic Auth nếu có), ghi ENV=TEST, lưu rồi trả lời "xong".</w:t>
       </w:r>
     </w:p>
     <w:p>
@@ -2737,7 +2899,7 @@
     </w:p>
     <w:p>
       <w:r>
-        <w:t>Không gõ tài khoản vào chat. Dùng file .auth/credentials.local.env: AI tạo template → bạn điền, ghi ENV=TEST → script tự đăng nhập (xem Bước 3).</w:t>
+        <w:t>Không gõ tài khoản vào chat. Dùng file .auth/credentials.local.env: copy từ mẫu (hoặc AI tạo template) → bạn điền, ghi ENV=TEST → script tự đăng nhập (xem Bước 3).</w:t>
       </w:r>
     </w:p>
     <w:sectPr>

</xml_diff>

<commit_message>
feat(designer-kit,ba-kit): đổi prototype-to-figma → document-to-figma; system-to-doc có sẵn inputs/ và .auth/ (#59)
designer-kit:
- Đổi tên kit prototype-to-figma → document-to-figma (folder, lệnh /document-to-figma, ảnh, docx)
- Đầu vào mở rộng: prototype HTML · SPEC · Basic Design · ảnh · link Figma wireframe
- prototype-intake.md → document-intake.md; vá chữ trong các ảnh hướng dẫn và docx

ba-kit/system-to-doc:
- Có sẵn inputs/{repo,db,cr}/ và .auth/ (credentials.example.env), mỗi folder có README
- Agent tự Glob inputs/repo, inputs/db trước khi hỏi đường dẫn
- .gitignore nội dung inputs/ và .auth/; cập nhật README, AGENTS, docx hướng dẫn
- Trỏ tham chiếu designer-kit sang tên mới

Co-authored-by: Claude Sonnet 5.5 <noreply@anthropic.com>
</commit_message>
<xml_diff>
--- a/ba-kit/system-to-doc/docs/Hướng dẫn sử dụng System to Doc.docx
+++ b/ba-kit/system-to-doc/docs/Hướng dẫn sử dụng System to Doc.docx
@@ -130,11 +130,173 @@
       </w:r>
     </w:p>
     <w:p>
-      <w:pPr>
-        <w:pStyle w:val="ListBullet"/>
-      </w:pPr>
       <w:r>
-        <w:t>Tạo thêm inputs/db/ (nếu có file schema) và inputs/cr/ (để bỏ yêu cầu thay đổi sau này).</w:t>
+        <w:t>Kit đã có sẵn các folder để bỏ file vào (mỗi folder có README.md hướng dẫn riêng):</w:t>
+      </w:r>
+    </w:p>
+    <w:tbl>
+      <w:tblPr>
+        <w:tblStyle w:val="TableGrid"/>
+        <w:tblW w:type="auto" w:w="0"/>
+        <w:tblLook w:firstColumn="1" w:firstRow="1" w:lastColumn="0" w:lastRow="0" w:noHBand="0" w:noVBand="1" w:val="04A0"/>
+      </w:tblPr>
+      <w:tblGrid>
+        <w:gridCol w:w="4986"/>
+        <w:gridCol w:w="4986"/>
+      </w:tblGrid>
+      <w:tr>
+        <w:tc>
+          <w:tcPr>
+            <w:tcW w:type="dxa" w:w="4986"/>
+          </w:tcPr>
+          <w:p>
+            <w:r>
+              <w:rPr>
+                <w:b/>
+                <w:sz w:val="19"/>
+              </w:rPr>
+              <w:t>Folder</w:t>
+            </w:r>
+          </w:p>
+        </w:tc>
+        <w:tc>
+          <w:tcPr>
+            <w:tcW w:type="dxa" w:w="4986"/>
+          </w:tcPr>
+          <w:p>
+            <w:r>
+              <w:rPr>
+                <w:b/>
+                <w:sz w:val="19"/>
+              </w:rPr>
+              <w:t>Bỏ gì vào</w:t>
+            </w:r>
+          </w:p>
+        </w:tc>
+      </w:tr>
+      <w:tr>
+        <w:tc>
+          <w:tcPr>
+            <w:tcW w:type="dxa" w:w="4986"/>
+          </w:tcPr>
+          <w:p>
+            <w:r>
+              <w:rPr>
+                <w:sz w:val="19"/>
+              </w:rPr>
+              <w:t>inputs/repo/</w:t>
+            </w:r>
+          </w:p>
+        </w:tc>
+        <w:tc>
+          <w:tcPr>
+            <w:tcW w:type="dxa" w:w="4986"/>
+          </w:tcPr>
+          <w:p>
+            <w:r>
+              <w:rPr>
+                <w:sz w:val="19"/>
+              </w:rPr>
+              <w:t>Source code hệ thống — mỗi repo 1 folder con (web-fe/, api/, batch/…). Không bỏ .env, key, node_modules.</w:t>
+            </w:r>
+          </w:p>
+        </w:tc>
+      </w:tr>
+      <w:tr>
+        <w:tc>
+          <w:tcPr>
+            <w:tcW w:type="dxa" w:w="4986"/>
+          </w:tcPr>
+          <w:p>
+            <w:r>
+              <w:rPr>
+                <w:sz w:val="19"/>
+              </w:rPr>
+              <w:t>inputs/db/</w:t>
+            </w:r>
+          </w:p>
+        </w:tc>
+        <w:tc>
+          <w:tcPr>
+            <w:tcW w:type="dxa" w:w="4986"/>
+          </w:tcPr>
+          <w:p>
+            <w:r>
+              <w:rPr>
+                <w:sz w:val="19"/>
+              </w:rPr>
+              <w:t>File schema.sql CHỈ cấu trúc (mysqldump --no-data / pg_dump --schema-only).</w:t>
+            </w:r>
+          </w:p>
+        </w:tc>
+      </w:tr>
+      <w:tr>
+        <w:tc>
+          <w:tcPr>
+            <w:tcW w:type="dxa" w:w="4986"/>
+          </w:tcPr>
+          <w:p>
+            <w:r>
+              <w:rPr>
+                <w:sz w:val="19"/>
+              </w:rPr>
+              <w:t>inputs/cr/</w:t>
+            </w:r>
+          </w:p>
+        </w:tc>
+        <w:tc>
+          <w:tcPr>
+            <w:tcW w:type="dxa" w:w="4986"/>
+          </w:tcPr>
+          <w:p>
+            <w:r>
+              <w:rPr>
+                <w:sz w:val="19"/>
+              </w:rPr>
+              <w:t>File yêu cầu thay đổi của khách (.docx .pdf .xlsx .md, ảnh) — dùng ở Luồng 2.</w:t>
+            </w:r>
+          </w:p>
+        </w:tc>
+      </w:tr>
+      <w:tr>
+        <w:tc>
+          <w:tcPr>
+            <w:tcW w:type="dxa" w:w="4986"/>
+          </w:tcPr>
+          <w:p>
+            <w:r>
+              <w:rPr>
+                <w:sz w:val="19"/>
+              </w:rPr>
+              <w:t>.auth/credentials.local.env</w:t>
+            </w:r>
+          </w:p>
+        </w:tc>
+        <w:tc>
+          <w:tcPr>
+            <w:tcW w:type="dxa" w:w="4986"/>
+          </w:tcPr>
+          <w:p>
+            <w:r>
+              <w:rPr>
+                <w:sz w:val="19"/>
+              </w:rPr>
+              <w:t>Tài khoản test website: copy từ .auth/credentials.example.env rồi điền (xem Bước 3).</w:t>
+            </w:r>
+          </w:p>
+        </w:tc>
+      </w:tr>
+    </w:tbl>
+    <w:p/>
+    <w:p>
+      <w:r>
+        <w:rPr>
+          <w:b/>
+        </w:rPr>
+        <w:t xml:space="preserve">Lưu ý: </w:t>
+      </w:r>
+      <w:r>
+        <w:t>Folder inputs/ và .auth/ đã được .gitignore — file bạn bỏ vào không bị commit. Có folder nào để trống, AI hỏi đường dẫn khác ở bước 2.</w:t>
       </w:r>
     </w:p>
     <w:p>
@@ -206,7 +368,7 @@
       <w:r>
         <w:drawing>
           <wp:inline xmlns:a="http://schemas.openxmlformats.org/drawingml/2006/main" xmlns:pic="http://schemas.openxmlformats.org/drawingml/2006/picture">
-            <wp:extent cx="4680000" cy="2652735"/>
+            <wp:extent cx="4680000" cy="2956848"/>
             <wp:docPr id="3" name="Picture 3"/>
             <wp:cNvGraphicFramePr>
               <a:graphicFrameLocks noChangeAspect="1"/>
@@ -227,7 +389,7 @@
                   <pic:spPr>
                     <a:xfrm>
                       <a:off x="0" y="0"/>
-                      <a:ext cx="4680000" cy="2652735"/>
+                      <a:ext cx="4680000" cy="2956848"/>
                     </a:xfrm>
                     <a:prstGeom prst="rect"/>
                   </pic:spPr>
@@ -555,7 +717,7 @@
               <w:rPr>
                 <w:sz w:val="19"/>
               </w:rPr>
-              <w:t>Số repo, đường dẫn, FE hay BE, repo FE thuộc website nào</w:t>
+              <w:t>Repo nào (AI tự liệt kê từ inputs/repo/), FE hay BE, repo FE thuộc website nào</w:t>
             </w:r>
           </w:p>
         </w:tc>
@@ -568,7 +730,7 @@
               <w:rPr>
                 <w:sz w:val="19"/>
               </w:rPr>
-              <w:t>Đường dẫn repo trên máy</w:t>
+              <w:t>Repo đã bỏ vào inputs/repo/</w:t>
             </w:r>
           </w:p>
         </w:tc>
@@ -609,7 +771,7 @@
               <w:rPr>
                 <w:sz w:val="19"/>
               </w:rPr>
-              <w:t>mysqldump --no-data hoặc pg_dump --schema-only</w:t>
+              <w:t>File .sql chỉ cấu trúc trong inputs/db/ (mysqldump --no-data / pg_dump --schema-only)</w:t>
             </w:r>
           </w:p>
         </w:tc>
@@ -783,7 +945,7 @@
         <w:t>Môi trường TEST</w:t>
       </w:r>
       <w:r>
-        <w:t xml:space="preserve"> — AI tạo file .auth/credentials.local.env có sẵn chỗ trống → bạn mở file, điền tài khoản (+ Basic Auth nếu có), ghi ENV=TEST, lưu rồi trả lời "xong".</w:t>
+        <w:t xml:space="preserve"> — điền sẵn file .auth/credentials.local.env (copy từ credentials.example.env; chưa có thì AI tạo với chỗ trống) → bạn mở file, điền URL, tài khoản (+ Basic Auth nếu có), ghi ENV=TEST, lưu rồi trả lời "xong".</w:t>
       </w:r>
     </w:p>
     <w:p>
@@ -2737,7 +2899,7 @@
     </w:p>
     <w:p>
       <w:r>
-        <w:t>Không gõ tài khoản vào chat. Dùng file .auth/credentials.local.env: AI tạo template → bạn điền, ghi ENV=TEST → script tự đăng nhập (xem Bước 3).</w:t>
+        <w:t>Không gõ tài khoản vào chat. Dùng file .auth/credentials.local.env: copy từ mẫu (hoặc AI tạo template) → bạn điền, ghi ENV=TEST → script tự đăng nhập (xem Bước 3).</w:t>
       </w:r>
     </w:p>
     <w:sectPr>

</xml_diff>

<commit_message>
refactor(ba-kit): system-to-doc — đánh số lại output: Tài liệu tổng hợp là O1
O1 Overview (01_Overview) · O2 Màn hình (02_Screens) · O3 API (03_API) · O4 DB (04_DB)
· O5 Figma (05_Figma) · O6 Design System tuỳ chọn (06_DesignSystem) · O7 Bug list · O8 DevSetup (08_DevSetup).
Chỉ đổi số + tên thư mục + tên file spec (o1-overview.md … o8-devsetup.md); thứ tự chạy giữ nguyên
(O1 vẫn sinh cuối). File copy từ requirement-to-flow (figma/*, ba-figma-output) không đụng.
Self-test: gates 73 · docs 29 · cr-impact 88 · basic-design 12 · version 18 · estimate 24 · design-system 53 — PASS.

Co-Authored-By: Claude Opus 5.5 <noreply@anthropic.com>
</commit_message>
<xml_diff>
--- a/ba-kit/system-to-doc/docs/Hướng dẫn sử dụng System to Doc.docx
+++ b/ba-kit/system-to-doc/docs/Hướng dẫn sử dụng System to Doc.docx
@@ -1290,7 +1290,48 @@
               <w:rPr>
                 <w:sz w:val="19"/>
               </w:rPr>
-              <w:t>O1 Danh sách màn hình</w:t>
+              <w:t>O1 Tài liệu tổng hợp</w:t>
+            </w:r>
+          </w:p>
+        </w:tc>
+        <w:tc>
+          <w:tcPr>
+            <w:tcW w:type="dxa" w:w="3324"/>
+          </w:tcPr>
+          <w:p>
+            <w:r>
+              <w:rPr>
+                <w:sz w:val="19"/>
+              </w:rPr>
+              <w:t>docx (nghiệp vụ chính + bảng tổng)</w:t>
+            </w:r>
+          </w:p>
+        </w:tc>
+        <w:tc>
+          <w:tcPr>
+            <w:tcW w:type="dxa" w:w="3324"/>
+          </w:tcPr>
+          <w:p>
+            <w:r>
+              <w:rPr>
+                <w:sz w:val="19"/>
+              </w:rPr>
+              <w:t>01_Overview/Overview_….docx</w:t>
+            </w:r>
+          </w:p>
+        </w:tc>
+      </w:tr>
+      <w:tr>
+        <w:tc>
+          <w:tcPr>
+            <w:tcW w:type="dxa" w:w="3324"/>
+          </w:tcPr>
+          <w:p>
+            <w:r>
+              <w:rPr>
+                <w:sz w:val="19"/>
+              </w:rPr>
+              <w:t>O2 Danh sách màn hình</w:t>
             </w:r>
           </w:p>
         </w:tc>
@@ -1316,7 +1357,7 @@
               <w:rPr>
                 <w:sz w:val="19"/>
               </w:rPr>
-              <w:t>01_Screens/BasicDesign_WEB-01_ver&lt;N&gt;.xlsx</w:t>
+              <w:t>02_Screens/BasicDesign_WEB-01_ver&lt;N&gt;.xlsx</w:t>
             </w:r>
           </w:p>
         </w:tc>
@@ -1331,7 +1372,7 @@
               <w:rPr>
                 <w:sz w:val="19"/>
               </w:rPr>
-              <w:t>O2 API Documentation</w:t>
+              <w:t>O3 API Documentation</w:t>
             </w:r>
           </w:p>
         </w:tc>
@@ -1357,7 +1398,7 @@
               <w:rPr>
                 <w:sz w:val="19"/>
               </w:rPr>
-              <w:t>02_API/</w:t>
+              <w:t>03_API/</w:t>
             </w:r>
           </w:p>
         </w:tc>
@@ -1372,7 +1413,7 @@
               <w:rPr>
                 <w:sz w:val="19"/>
               </w:rPr>
-              <w:t>O3 Database Documentation</w:t>
+              <w:t>O4 Database Documentation</w:t>
             </w:r>
           </w:p>
         </w:tc>
@@ -1398,48 +1439,7 @@
               <w:rPr>
                 <w:sz w:val="19"/>
               </w:rPr>
-              <w:t>03_DB/</w:t>
-            </w:r>
-          </w:p>
-        </w:tc>
-      </w:tr>
-      <w:tr>
-        <w:tc>
-          <w:tcPr>
-            <w:tcW w:type="dxa" w:w="3324"/>
-          </w:tcPr>
-          <w:p>
-            <w:r>
-              <w:rPr>
-                <w:sz w:val="19"/>
-              </w:rPr>
-              <w:t>O4 Design System (tuỳ chọn)</w:t>
-            </w:r>
-          </w:p>
-        </w:tc>
-        <w:tc>
-          <w:tcPr>
-            <w:tcW w:type="dxa" w:w="3324"/>
-          </w:tcPr>
-          <w:p>
-            <w:r>
-              <w:rPr>
-                <w:sz w:val="19"/>
-              </w:rPr>
-              <w:t>link artifact claude.ai + folder</w:t>
-            </w:r>
-          </w:p>
-        </w:tc>
-        <w:tc>
-          <w:tcPr>
-            <w:tcW w:type="dxa" w:w="3324"/>
-          </w:tcPr>
-          <w:p>
-            <w:r>
-              <w:rPr>
-                <w:sz w:val="19"/>
-              </w:rPr>
-              <w:t>04_DesignSystem/ (STATUS.md + project/)</w:t>
+              <w:t>04_DB/</w:t>
             </w:r>
           </w:p>
         </w:tc>
@@ -1495,7 +1495,7 @@
               <w:rPr>
                 <w:sz w:val="19"/>
               </w:rPr>
-              <w:t>O6 Tài liệu tổng hợp</w:t>
+              <w:t>O6 Design System (tuỳ chọn)</w:t>
             </w:r>
           </w:p>
         </w:tc>
@@ -1508,7 +1508,7 @@
               <w:rPr>
                 <w:sz w:val="19"/>
               </w:rPr>
-              <w:t>docx (nghiệp vụ chính + bảng tổng)</w:t>
+              <w:t>link artifact claude.ai + folder</w:t>
             </w:r>
           </w:p>
         </w:tc>
@@ -1521,7 +1521,7 @@
               <w:rPr>
                 <w:sz w:val="19"/>
               </w:rPr>
-              <w:t>06_Overview/Overview_….docx</w:t>
+              <w:t>06_DesignSystem/ (STATUS.md + project/)</w:t>
             </w:r>
           </w:p>
         </w:tc>
@@ -1577,7 +1577,7 @@
               <w:rPr>
                 <w:sz w:val="19"/>
               </w:rPr>
-              <w:t>O9 Hướng dẫn chạy local</w:t>
+              <w:t>O8 Hướng dẫn chạy local</w:t>
             </w:r>
           </w:p>
         </w:tc>
@@ -1603,7 +1603,7 @@
               <w:rPr>
                 <w:sz w:val="19"/>
               </w:rPr>
-              <w:t>09_DevSetup/DevSetup_….md</w:t>
+              <w:t>08_DevSetup/DevSetup_….md</w:t>
             </w:r>
           </w:p>
         </w:tc>
@@ -1667,7 +1667,90 @@
         <w:pStyle w:val="Heading3"/>
       </w:pPr>
       <w:r>
-        <w:t>O1 — Danh sách màn hình (Basic Design xlsx)</w:t>
+        <w:t>O1 — Tài liệu tổng hợp (docx)</w:t>
+      </w:r>
+    </w:p>
+    <w:p>
+      <w:pPr>
+        <w:pStyle w:val="ListBullet"/>
+      </w:pPr>
+      <w:r>
+        <w:t>Dùng để: đọc nhanh hệ thống làm gì, các luồng nghiệp vụ chính (bước đánh số), trạng thái đối tượng chính.</w:t>
+      </w:r>
+    </w:p>
+    <w:p>
+      <w:pPr>
+        <w:pStyle w:val="ListBullet"/>
+      </w:pPr>
+      <w:r>
+        <w:t>Màn hình, API, database chỉ có bảng tổng; danh sách chi tiết ở O2 / O3 / O4. Sơ đồ DB là link Figma.</w:t>
+      </w:r>
+    </w:p>
+    <w:p>
+      <w:pPr>
+        <w:pStyle w:val="ListBullet"/>
+      </w:pPr>
+      <w:r>
+        <w:t>Mở: 01_Overview/Overview_….docx bằng Word.</w:t>
+      </w:r>
+    </w:p>
+    <w:p>
+      <w:pPr>
+        <w:jc w:val="center"/>
+      </w:pPr>
+      <w:r>
+        <w:drawing>
+          <wp:inline xmlns:a="http://schemas.openxmlformats.org/drawingml/2006/main" xmlns:pic="http://schemas.openxmlformats.org/drawingml/2006/picture">
+            <wp:extent cx="3960000" cy="3872000"/>
+            <wp:docPr id="10" name="Picture 10"/>
+            <wp:cNvGraphicFramePr>
+              <a:graphicFrameLocks noChangeAspect="1"/>
+            </wp:cNvGraphicFramePr>
+            <a:graphic>
+              <a:graphicData uri="http://schemas.openxmlformats.org/drawingml/2006/picture">
+                <pic:pic>
+                  <pic:nvPicPr>
+                    <pic:cNvPr id="0" name="output_O6.png"/>
+                    <pic:cNvPicPr/>
+                  </pic:nvPicPr>
+                  <pic:blipFill>
+                    <a:blip r:embed="rId18"/>
+                    <a:stretch>
+                      <a:fillRect/>
+                    </a:stretch>
+                  </pic:blipFill>
+                  <pic:spPr>
+                    <a:xfrm>
+                      <a:off x="0" y="0"/>
+                      <a:ext cx="3960000" cy="3872000"/>
+                    </a:xfrm>
+                    <a:prstGeom prst="rect"/>
+                  </pic:spPr>
+                </pic:pic>
+              </a:graphicData>
+            </a:graphic>
+          </wp:inline>
+        </w:drawing>
+      </w:r>
+    </w:p>
+    <w:p>
+      <w:pPr>
+        <w:jc w:val="center"/>
+      </w:pPr>
+      <w:r>
+        <w:rPr>
+          <w:i/>
+          <w:sz w:val="18"/>
+        </w:rPr>
+        <w:t>Hình minh họa — O1 — tài liệu tổng hợp</w:t>
+      </w:r>
+    </w:p>
+    <w:p>
+      <w:pPr>
+        <w:pStyle w:val="Heading3"/>
+      </w:pPr>
+      <w:r>
+        <w:t>O2 — Danh sách màn hình (Basic Design xlsx)</w:t>
       </w:r>
     </w:p>
     <w:p>
@@ -1702,7 +1785,7 @@
         <w:drawing>
           <wp:inline xmlns:a="http://schemas.openxmlformats.org/drawingml/2006/main" xmlns:pic="http://schemas.openxmlformats.org/drawingml/2006/picture">
             <wp:extent cx="5400000" cy="2305866"/>
-            <wp:docPr id="10" name="Picture 10"/>
+            <wp:docPr id="11" name="Picture 11"/>
             <wp:cNvGraphicFramePr>
               <a:graphicFrameLocks noChangeAspect="1"/>
             </wp:cNvGraphicFramePr>
@@ -1714,7 +1797,7 @@
                     <pic:cNvPicPr/>
                   </pic:nvPicPr>
                   <pic:blipFill>
-                    <a:blip r:embed="rId18"/>
+                    <a:blip r:embed="rId19"/>
                     <a:stretch>
                       <a:fillRect/>
                     </a:stretch>
@@ -1742,7 +1825,7 @@
           <w:i/>
           <w:sz w:val="18"/>
         </w:rPr>
-        <w:t>Hình minh họa — O1 — sheet Screen Index</w:t>
+        <w:t>Hình minh họa — O2 — sheet Screen Index</w:t>
       </w:r>
     </w:p>
     <w:p>
@@ -1750,7 +1833,7 @@
         <w:pStyle w:val="Heading3"/>
       </w:pPr>
       <w:r>
-        <w:t>O2 — API Documentation (xlsx)</w:t>
+        <w:t>O3 — API Documentation (xlsx)</w:t>
       </w:r>
     </w:p>
     <w:p>
@@ -1777,7 +1860,7 @@
         <w:drawing>
           <wp:inline xmlns:a="http://schemas.openxmlformats.org/drawingml/2006/main" xmlns:pic="http://schemas.openxmlformats.org/drawingml/2006/picture">
             <wp:extent cx="5400000" cy="2304198"/>
-            <wp:docPr id="11" name="Picture 11"/>
+            <wp:docPr id="12" name="Picture 12"/>
             <wp:cNvGraphicFramePr>
               <a:graphicFrameLocks noChangeAspect="1"/>
             </wp:cNvGraphicFramePr>
@@ -1789,7 +1872,7 @@
                     <pic:cNvPicPr/>
                   </pic:nvPicPr>
                   <pic:blipFill>
-                    <a:blip r:embed="rId19"/>
+                    <a:blip r:embed="rId20"/>
                     <a:stretch>
                       <a:fillRect/>
                     </a:stretch>
@@ -1817,7 +1900,7 @@
           <w:i/>
           <w:sz w:val="18"/>
         </w:rPr>
-        <w:t>Hình minh họa — O2 — sheet 00_Index</w:t>
+        <w:t>Hình minh họa — O3 — sheet 00_Index</w:t>
       </w:r>
     </w:p>
     <w:p>
@@ -1825,7 +1908,7 @@
         <w:pStyle w:val="Heading3"/>
       </w:pPr>
       <w:r>
-        <w:t>O3 — Database Documentation (xlsx + ERD)</w:t>
+        <w:t>O4 — Database Documentation (xlsx + ERD)</w:t>
       </w:r>
     </w:p>
     <w:p>
@@ -1852,7 +1935,7 @@
         <w:drawing>
           <wp:inline xmlns:a="http://schemas.openxmlformats.org/drawingml/2006/main" xmlns:pic="http://schemas.openxmlformats.org/drawingml/2006/picture">
             <wp:extent cx="5400000" cy="2293608"/>
-            <wp:docPr id="12" name="Picture 12"/>
+            <wp:docPr id="13" name="Picture 13"/>
             <wp:cNvGraphicFramePr>
               <a:graphicFrameLocks noChangeAspect="1"/>
             </wp:cNvGraphicFramePr>
@@ -1864,7 +1947,7 @@
                     <pic:cNvPicPr/>
                   </pic:nvPicPr>
                   <pic:blipFill>
-                    <a:blip r:embed="rId20"/>
+                    <a:blip r:embed="rId21"/>
                     <a:stretch>
                       <a:fillRect/>
                     </a:stretch>
@@ -1892,90 +1975,7 @@
           <w:i/>
           <w:sz w:val="18"/>
         </w:rPr>
-        <w:t>Hình minh họa — O3 — sheet 02_ERD</w:t>
-      </w:r>
-    </w:p>
-    <w:p>
-      <w:pPr>
-        <w:pStyle w:val="Heading3"/>
-      </w:pPr>
-      <w:r>
-        <w:t>O4 — Design System (tuỳ chọn, link artifact claude.ai)</w:t>
-      </w:r>
-    </w:p>
-    <w:p>
-      <w:pPr>
-        <w:pStyle w:val="ListBullet"/>
-      </w:pPr>
-      <w:r>
-        <w:t>Dùng để: tra màu, chữ, spacing, component có preview của hệ thống cũ — dùng lại khi làm màn mới (cùng chuẩn với designer-kit).</w:t>
-      </w:r>
-    </w:p>
-    <w:p>
-      <w:pPr>
-        <w:pStyle w:val="ListBullet"/>
-      </w:pPr>
-      <w:r>
-        <w:t>Mở: link artifact private AI in ra (VD https://claude.ai/artifact/L6VfhzcbZmpfo1wfpYoD2E); bản file nằm ở 04_DesignSystem/.</w:t>
-      </w:r>
-    </w:p>
-    <w:p>
-      <w:pPr>
-        <w:pStyle w:val="ListBullet"/>
-      </w:pPr>
-      <w:r>
-        <w:t>Nhiều website: chỉ khác màu → 1 Design System mỗi site 1 theme; khác cả phong cách → mỗi site 1 link riêng.</w:t>
-      </w:r>
-    </w:p>
-    <w:p>
-      <w:pPr>
-        <w:jc w:val="center"/>
-      </w:pPr>
-      <w:r>
-        <w:drawing>
-          <wp:inline xmlns:a="http://schemas.openxmlformats.org/drawingml/2006/main" xmlns:pic="http://schemas.openxmlformats.org/drawingml/2006/picture">
-            <wp:extent cx="5400000" cy="2703673"/>
-            <wp:docPr id="13" name="Picture 13"/>
-            <wp:cNvGraphicFramePr>
-              <a:graphicFrameLocks noChangeAspect="1"/>
-            </wp:cNvGraphicFramePr>
-            <a:graphic>
-              <a:graphicData uri="http://schemas.openxmlformats.org/drawingml/2006/picture">
-                <pic:pic>
-                  <pic:nvPicPr>
-                    <pic:cNvPr id="0" name="output_O4.png"/>
-                    <pic:cNvPicPr/>
-                  </pic:nvPicPr>
-                  <pic:blipFill>
-                    <a:blip r:embed="rId21"/>
-                    <a:stretch>
-                      <a:fillRect/>
-                    </a:stretch>
-                  </pic:blipFill>
-                  <pic:spPr>
-                    <a:xfrm>
-                      <a:off x="0" y="0"/>
-                      <a:ext cx="5400000" cy="2703673"/>
-                    </a:xfrm>
-                    <a:prstGeom prst="rect"/>
-                  </pic:spPr>
-                </pic:pic>
-              </a:graphicData>
-            </a:graphic>
-          </wp:inline>
-        </w:drawing>
-      </w:r>
-    </w:p>
-    <w:p>
-      <w:pPr>
-        <w:jc w:val="center"/>
-      </w:pPr>
-      <w:r>
-        <w:rPr>
-          <w:i/>
-          <w:sz w:val="18"/>
-        </w:rPr>
-        <w:t>Hình minh họa — O4 — trang Components của artifact Design System</w:t>
+        <w:t>Hình minh họa — O4 — sheet 02_ERD</w:t>
       </w:r>
     </w:p>
     <w:p>
@@ -2058,7 +2058,7 @@
         <w:pStyle w:val="Heading3"/>
       </w:pPr>
       <w:r>
-        <w:t>O6 — Tài liệu tổng hợp (docx)</w:t>
+        <w:t>O6 — Design System (tuỳ chọn, link artifact claude.ai)</w:t>
       </w:r>
     </w:p>
     <w:p>
@@ -2066,7 +2066,7 @@
         <w:pStyle w:val="ListBullet"/>
       </w:pPr>
       <w:r>
-        <w:t>Dùng để: đọc nhanh hệ thống làm gì, các luồng nghiệp vụ chính (bước đánh số), trạng thái đối tượng chính.</w:t>
+        <w:t>Dùng để: tra màu, chữ, spacing, component có preview của hệ thống cũ — dùng lại khi làm màn mới (cùng chuẩn với designer-kit).</w:t>
       </w:r>
     </w:p>
     <w:p>
@@ -2074,7 +2074,7 @@
         <w:pStyle w:val="ListBullet"/>
       </w:pPr>
       <w:r>
-        <w:t>Màn hình, API, database chỉ có bảng tổng; danh sách chi tiết ở O1 / O2 / O3. Sơ đồ DB là link Figma.</w:t>
+        <w:t>Mở: link artifact private AI in ra (VD https://claude.ai/artifact/L6VfhzcbZmpfo1wfpYoD2E); bản file nằm ở 06_DesignSystem/.</w:t>
       </w:r>
     </w:p>
     <w:p>
@@ -2082,7 +2082,7 @@
         <w:pStyle w:val="ListBullet"/>
       </w:pPr>
       <w:r>
-        <w:t>Mở: 06_Overview/Overview_….docx bằng Word.</w:t>
+        <w:t>Nhiều website: chỉ khác màu → 1 Design System mỗi site 1 theme; khác cả phong cách → mỗi site 1 link riêng.</w:t>
       </w:r>
     </w:p>
     <w:p>
@@ -2092,7 +2092,7 @@
       <w:r>
         <w:drawing>
           <wp:inline xmlns:a="http://schemas.openxmlformats.org/drawingml/2006/main" xmlns:pic="http://schemas.openxmlformats.org/drawingml/2006/picture">
-            <wp:extent cx="3960000" cy="3872000"/>
+            <wp:extent cx="5400000" cy="2703673"/>
             <wp:docPr id="15" name="Picture 15"/>
             <wp:cNvGraphicFramePr>
               <a:graphicFrameLocks noChangeAspect="1"/>
@@ -2101,7 +2101,7 @@
               <a:graphicData uri="http://schemas.openxmlformats.org/drawingml/2006/picture">
                 <pic:pic>
                   <pic:nvPicPr>
-                    <pic:cNvPr id="0" name="output_O6.png"/>
+                    <pic:cNvPr id="0" name="output_O4.png"/>
                     <pic:cNvPicPr/>
                   </pic:nvPicPr>
                   <pic:blipFill>
@@ -2113,7 +2113,7 @@
                   <pic:spPr>
                     <a:xfrm>
                       <a:off x="0" y="0"/>
-                      <a:ext cx="3960000" cy="3872000"/>
+                      <a:ext cx="5400000" cy="2703673"/>
                     </a:xfrm>
                     <a:prstGeom prst="rect"/>
                   </pic:spPr>
@@ -2133,7 +2133,7 @@
           <w:i/>
           <w:sz w:val="18"/>
         </w:rPr>
-        <w:t>Hình minh họa — O6 — tài liệu tổng hợp</w:t>
+        <w:t>Hình minh họa — O6 — trang Components của artifact Design System</w:t>
       </w:r>
     </w:p>
     <w:p>
@@ -2232,7 +2232,7 @@
         <w:pStyle w:val="Heading3"/>
       </w:pPr>
       <w:r>
-        <w:t>O9 — Hướng dẫn chạy local (md, cho dev)</w:t>
+        <w:t>O8 — Hướng dẫn chạy local (md, cho dev)</w:t>
       </w:r>
     </w:p>
     <w:p>
@@ -2256,7 +2256,7 @@
         <w:pStyle w:val="ListBullet"/>
       </w:pPr>
       <w:r>
-        <w:t>Mở: 09_DevSetup/DevSetup_….md.</w:t>
+        <w:t>Mở: 08_DevSetup/DevSetup_….md.</w:t>
       </w:r>
     </w:p>
     <w:p>

</xml_diff>

<commit_message>
refactor(ba-kit): system-to-doc — thứ tự output: Overview · API · DB · Figma · Basic Design
O1 01_Overview · O2 02_API · O3 03_DB · O4 04_Figma (Output 1-2 + ERD) · O5 05_BasicDesign (đổi tên từ
_Screens) · O6 06_DesignSystem · O7 07_BugList · O8 08_DevSetup. Spec: o2-api-doc · o3-db-doc · o4-figma ·
o5-basic-design. Thứ tự chạy giữ nguyên. Self-test 7 bộ PASS.

Co-Authored-By: Claude Opus 5.5 <noreply@anthropic.com>
</commit_message>
<xml_diff>
--- a/ba-kit/system-to-doc/docs/Hướng dẫn sử dụng System to Doc.docx
+++ b/ba-kit/system-to-doc/docs/Hướng dẫn sử dụng System to Doc.docx
@@ -1331,7 +1331,130 @@
               <w:rPr>
                 <w:sz w:val="19"/>
               </w:rPr>
-              <w:t>O2 Danh sách màn hình</w:t>
+              <w:t>O2 API Documentation</w:t>
+            </w:r>
+          </w:p>
+        </w:tc>
+        <w:tc>
+          <w:tcPr>
+            <w:tcW w:type="dxa" w:w="3324"/>
+          </w:tcPr>
+          <w:p>
+            <w:r>
+              <w:rPr>
+                <w:sz w:val="19"/>
+              </w:rPr>
+              <w:t>xlsx</w:t>
+            </w:r>
+          </w:p>
+        </w:tc>
+        <w:tc>
+          <w:tcPr>
+            <w:tcW w:type="dxa" w:w="3324"/>
+          </w:tcPr>
+          <w:p>
+            <w:r>
+              <w:rPr>
+                <w:sz w:val="19"/>
+              </w:rPr>
+              <w:t>02_API/</w:t>
+            </w:r>
+          </w:p>
+        </w:tc>
+      </w:tr>
+      <w:tr>
+        <w:tc>
+          <w:tcPr>
+            <w:tcW w:type="dxa" w:w="3324"/>
+          </w:tcPr>
+          <w:p>
+            <w:r>
+              <w:rPr>
+                <w:sz w:val="19"/>
+              </w:rPr>
+              <w:t>O3 Database Documentation</w:t>
+            </w:r>
+          </w:p>
+        </w:tc>
+        <w:tc>
+          <w:tcPr>
+            <w:tcW w:type="dxa" w:w="3324"/>
+          </w:tcPr>
+          <w:p>
+            <w:r>
+              <w:rPr>
+                <w:sz w:val="19"/>
+              </w:rPr>
+              <w:t>xlsx + png ERD</w:t>
+            </w:r>
+          </w:p>
+        </w:tc>
+        <w:tc>
+          <w:tcPr>
+            <w:tcW w:type="dxa" w:w="3324"/>
+          </w:tcPr>
+          <w:p>
+            <w:r>
+              <w:rPr>
+                <w:sz w:val="19"/>
+              </w:rPr>
+              <w:t>03_DB/</w:t>
+            </w:r>
+          </w:p>
+        </w:tc>
+      </w:tr>
+      <w:tr>
+        <w:tc>
+          <w:tcPr>
+            <w:tcW w:type="dxa" w:w="3324"/>
+          </w:tcPr>
+          <w:p>
+            <w:r>
+              <w:rPr>
+                <w:sz w:val="19"/>
+              </w:rPr>
+              <w:t>O4 Figma flow</w:t>
+            </w:r>
+          </w:p>
+        </w:tc>
+        <w:tc>
+          <w:tcPr>
+            <w:tcW w:type="dxa" w:w="3324"/>
+          </w:tcPr>
+          <w:p>
+            <w:r>
+              <w:rPr>
+                <w:sz w:val="19"/>
+              </w:rPr>
+              <w:t>link Figma</w:t>
+            </w:r>
+          </w:p>
+        </w:tc>
+        <w:tc>
+          <w:tcPr>
+            <w:tcW w:type="dxa" w:w="3324"/>
+          </w:tcPr>
+          <w:p>
+            <w:r>
+              <w:rPr>
+                <w:sz w:val="19"/>
+              </w:rPr>
+              <w:t>04_Figma/figma-links.md</w:t>
+            </w:r>
+          </w:p>
+        </w:tc>
+      </w:tr>
+      <w:tr>
+        <w:tc>
+          <w:tcPr>
+            <w:tcW w:type="dxa" w:w="3324"/>
+          </w:tcPr>
+          <w:p>
+            <w:r>
+              <w:rPr>
+                <w:sz w:val="19"/>
+              </w:rPr>
+              <w:t>O5 Danh sách màn hình</w:t>
             </w:r>
           </w:p>
         </w:tc>
@@ -1357,130 +1480,7 @@
               <w:rPr>
                 <w:sz w:val="19"/>
               </w:rPr>
-              <w:t>02_Screens/BasicDesign_WEB-01_ver&lt;N&gt;.xlsx</w:t>
-            </w:r>
-          </w:p>
-        </w:tc>
-      </w:tr>
-      <w:tr>
-        <w:tc>
-          <w:tcPr>
-            <w:tcW w:type="dxa" w:w="3324"/>
-          </w:tcPr>
-          <w:p>
-            <w:r>
-              <w:rPr>
-                <w:sz w:val="19"/>
-              </w:rPr>
-              <w:t>O3 API Documentation</w:t>
-            </w:r>
-          </w:p>
-        </w:tc>
-        <w:tc>
-          <w:tcPr>
-            <w:tcW w:type="dxa" w:w="3324"/>
-          </w:tcPr>
-          <w:p>
-            <w:r>
-              <w:rPr>
-                <w:sz w:val="19"/>
-              </w:rPr>
-              <w:t>xlsx</w:t>
-            </w:r>
-          </w:p>
-        </w:tc>
-        <w:tc>
-          <w:tcPr>
-            <w:tcW w:type="dxa" w:w="3324"/>
-          </w:tcPr>
-          <w:p>
-            <w:r>
-              <w:rPr>
-                <w:sz w:val="19"/>
-              </w:rPr>
-              <w:t>03_API/</w:t>
-            </w:r>
-          </w:p>
-        </w:tc>
-      </w:tr>
-      <w:tr>
-        <w:tc>
-          <w:tcPr>
-            <w:tcW w:type="dxa" w:w="3324"/>
-          </w:tcPr>
-          <w:p>
-            <w:r>
-              <w:rPr>
-                <w:sz w:val="19"/>
-              </w:rPr>
-              <w:t>O4 Database Documentation</w:t>
-            </w:r>
-          </w:p>
-        </w:tc>
-        <w:tc>
-          <w:tcPr>
-            <w:tcW w:type="dxa" w:w="3324"/>
-          </w:tcPr>
-          <w:p>
-            <w:r>
-              <w:rPr>
-                <w:sz w:val="19"/>
-              </w:rPr>
-              <w:t>xlsx + png ERD</w:t>
-            </w:r>
-          </w:p>
-        </w:tc>
-        <w:tc>
-          <w:tcPr>
-            <w:tcW w:type="dxa" w:w="3324"/>
-          </w:tcPr>
-          <w:p>
-            <w:r>
-              <w:rPr>
-                <w:sz w:val="19"/>
-              </w:rPr>
-              <w:t>04_DB/</w:t>
-            </w:r>
-          </w:p>
-        </w:tc>
-      </w:tr>
-      <w:tr>
-        <w:tc>
-          <w:tcPr>
-            <w:tcW w:type="dxa" w:w="3324"/>
-          </w:tcPr>
-          <w:p>
-            <w:r>
-              <w:rPr>
-                <w:sz w:val="19"/>
-              </w:rPr>
-              <w:t>O5 Figma flow</w:t>
-            </w:r>
-          </w:p>
-        </w:tc>
-        <w:tc>
-          <w:tcPr>
-            <w:tcW w:type="dxa" w:w="3324"/>
-          </w:tcPr>
-          <w:p>
-            <w:r>
-              <w:rPr>
-                <w:sz w:val="19"/>
-              </w:rPr>
-              <w:t>link Figma</w:t>
-            </w:r>
-          </w:p>
-        </w:tc>
-        <w:tc>
-          <w:tcPr>
-            <w:tcW w:type="dxa" w:w="3324"/>
-          </w:tcPr>
-          <w:p>
-            <w:r>
-              <w:rPr>
-                <w:sz w:val="19"/>
-              </w:rPr>
-              <w:t>05_Figma/figma-links.md</w:t>
+              <w:t>05_BasicDesign/BasicDesign_WEB-01_ver&lt;N&gt;.xlsx</w:t>
             </w:r>
           </w:p>
         </w:tc>
@@ -1683,7 +1683,7 @@
         <w:pStyle w:val="ListBullet"/>
       </w:pPr>
       <w:r>
-        <w:t>Màn hình, API, database chỉ có bảng tổng; danh sách chi tiết ở O2 / O3 / O4. Sơ đồ DB là link Figma.</w:t>
+        <w:t>Màn hình, API, database chỉ có bảng tổng; danh sách chi tiết ở O5 / O2 / O3. Sơ đồ DB là link Figma.</w:t>
       </w:r>
     </w:p>
     <w:p>
@@ -1750,7 +1750,232 @@
         <w:pStyle w:val="Heading3"/>
       </w:pPr>
       <w:r>
-        <w:t>O2 — Danh sách màn hình (Basic Design xlsx)</w:t>
+        <w:t>O2 — API Documentation (xlsx)</w:t>
+      </w:r>
+    </w:p>
+    <w:p>
+      <w:pPr>
+        <w:pStyle w:val="ListBullet"/>
+      </w:pPr>
+      <w:r>
+        <w:t>Dùng để: tra mọi API / batch theo group — làm gì, method, request, response, màn nào gọi.</w:t>
+      </w:r>
+    </w:p>
+    <w:p>
+      <w:pPr>
+        <w:pStyle w:val="ListBullet"/>
+      </w:pPr>
+      <w:r>
+        <w:t>Mở: sheet 00_Index → bấm API ID để tới block chi tiết.</w:t>
+      </w:r>
+    </w:p>
+    <w:p>
+      <w:pPr>
+        <w:jc w:val="center"/>
+      </w:pPr>
+      <w:r>
+        <w:drawing>
+          <wp:inline xmlns:a="http://schemas.openxmlformats.org/drawingml/2006/main" xmlns:pic="http://schemas.openxmlformats.org/drawingml/2006/picture">
+            <wp:extent cx="5400000" cy="2304198"/>
+            <wp:docPr id="11" name="Picture 11"/>
+            <wp:cNvGraphicFramePr>
+              <a:graphicFrameLocks noChangeAspect="1"/>
+            </wp:cNvGraphicFramePr>
+            <a:graphic>
+              <a:graphicData uri="http://schemas.openxmlformats.org/drawingml/2006/picture">
+                <pic:pic>
+                  <pic:nvPicPr>
+                    <pic:cNvPr id="0" name="output_O2.png"/>
+                    <pic:cNvPicPr/>
+                  </pic:nvPicPr>
+                  <pic:blipFill>
+                    <a:blip r:embed="rId19"/>
+                    <a:stretch>
+                      <a:fillRect/>
+                    </a:stretch>
+                  </pic:blipFill>
+                  <pic:spPr>
+                    <a:xfrm>
+                      <a:off x="0" y="0"/>
+                      <a:ext cx="5400000" cy="2304198"/>
+                    </a:xfrm>
+                    <a:prstGeom prst="rect"/>
+                  </pic:spPr>
+                </pic:pic>
+              </a:graphicData>
+            </a:graphic>
+          </wp:inline>
+        </w:drawing>
+      </w:r>
+    </w:p>
+    <w:p>
+      <w:pPr>
+        <w:jc w:val="center"/>
+      </w:pPr>
+      <w:r>
+        <w:rPr>
+          <w:i/>
+          <w:sz w:val="18"/>
+        </w:rPr>
+        <w:t>Hình minh họa — O2 — sheet 00_Index</w:t>
+      </w:r>
+    </w:p>
+    <w:p>
+      <w:pPr>
+        <w:pStyle w:val="Heading3"/>
+      </w:pPr>
+      <w:r>
+        <w:t>O3 — Database Documentation (xlsx + ERD)</w:t>
+      </w:r>
+    </w:p>
+    <w:p>
+      <w:pPr>
+        <w:pStyle w:val="ListBullet"/>
+      </w:pPr>
+      <w:r>
+        <w:t>Dùng để: xem các bảng, quan hệ, từng cột (kiểu, format, giới hạn, mục đích).</w:t>
+      </w:r>
+    </w:p>
+    <w:p>
+      <w:pPr>
+        <w:pStyle w:val="ListBullet"/>
+      </w:pPr>
+      <w:r>
+        <w:t>Mở: sheet 00_Overview → 02_ERD (sơ đồ) → mỗi bảng 1 sheet T_…</w:t>
+      </w:r>
+    </w:p>
+    <w:p>
+      <w:pPr>
+        <w:jc w:val="center"/>
+      </w:pPr>
+      <w:r>
+        <w:drawing>
+          <wp:inline xmlns:a="http://schemas.openxmlformats.org/drawingml/2006/main" xmlns:pic="http://schemas.openxmlformats.org/drawingml/2006/picture">
+            <wp:extent cx="5400000" cy="2293608"/>
+            <wp:docPr id="12" name="Picture 12"/>
+            <wp:cNvGraphicFramePr>
+              <a:graphicFrameLocks noChangeAspect="1"/>
+            </wp:cNvGraphicFramePr>
+            <a:graphic>
+              <a:graphicData uri="http://schemas.openxmlformats.org/drawingml/2006/picture">
+                <pic:pic>
+                  <pic:nvPicPr>
+                    <pic:cNvPr id="0" name="output_O3.png"/>
+                    <pic:cNvPicPr/>
+                  </pic:nvPicPr>
+                  <pic:blipFill>
+                    <a:blip r:embed="rId20"/>
+                    <a:stretch>
+                      <a:fillRect/>
+                    </a:stretch>
+                  </pic:blipFill>
+                  <pic:spPr>
+                    <a:xfrm>
+                      <a:off x="0" y="0"/>
+                      <a:ext cx="5400000" cy="2293608"/>
+                    </a:xfrm>
+                    <a:prstGeom prst="rect"/>
+                  </pic:spPr>
+                </pic:pic>
+              </a:graphicData>
+            </a:graphic>
+          </wp:inline>
+        </w:drawing>
+      </w:r>
+    </w:p>
+    <w:p>
+      <w:pPr>
+        <w:jc w:val="center"/>
+      </w:pPr>
+      <w:r>
+        <w:rPr>
+          <w:i/>
+          <w:sz w:val="18"/>
+        </w:rPr>
+        <w:t>Hình minh họa — O3 — sheet 02_ERD</w:t>
+      </w:r>
+    </w:p>
+    <w:p>
+      <w:pPr>
+        <w:pStyle w:val="Heading3"/>
+      </w:pPr>
+      <w:r>
+        <w:t>O4 — Figma flow</w:t>
+      </w:r>
+    </w:p>
+    <w:p>
+      <w:pPr>
+        <w:pStyle w:val="ListBullet"/>
+      </w:pPr>
+      <w:r>
+        <w:t>Dùng để: xem Flow tổng quan + Screen flow (màn nào dẫn tới màn nào, nhánh lỗi / edge).</w:t>
+      </w:r>
+    </w:p>
+    <w:p>
+      <w:pPr>
+        <w:pStyle w:val="ListBullet"/>
+      </w:pPr>
+      <w:r>
+        <w:t>Mở: link trong 04_Figma/figma-links.md.</w:t>
+      </w:r>
+    </w:p>
+    <w:p>
+      <w:pPr>
+        <w:jc w:val="center"/>
+      </w:pPr>
+      <w:r>
+        <w:drawing>
+          <wp:inline xmlns:a="http://schemas.openxmlformats.org/drawingml/2006/main" xmlns:pic="http://schemas.openxmlformats.org/drawingml/2006/picture">
+            <wp:extent cx="5400000" cy="2843265"/>
+            <wp:docPr id="13" name="Picture 13"/>
+            <wp:cNvGraphicFramePr>
+              <a:graphicFrameLocks noChangeAspect="1"/>
+            </wp:cNvGraphicFramePr>
+            <a:graphic>
+              <a:graphicData uri="http://schemas.openxmlformats.org/drawingml/2006/picture">
+                <pic:pic>
+                  <pic:nvPicPr>
+                    <pic:cNvPr id="0" name="output_O5.png"/>
+                    <pic:cNvPicPr/>
+                  </pic:nvPicPr>
+                  <pic:blipFill>
+                    <a:blip r:embed="rId21"/>
+                    <a:stretch>
+                      <a:fillRect/>
+                    </a:stretch>
+                  </pic:blipFill>
+                  <pic:spPr>
+                    <a:xfrm>
+                      <a:off x="0" y="0"/>
+                      <a:ext cx="5400000" cy="2843265"/>
+                    </a:xfrm>
+                    <a:prstGeom prst="rect"/>
+                  </pic:spPr>
+                </pic:pic>
+              </a:graphicData>
+            </a:graphic>
+          </wp:inline>
+        </w:drawing>
+      </w:r>
+    </w:p>
+    <w:p>
+      <w:pPr>
+        <w:jc w:val="center"/>
+      </w:pPr>
+      <w:r>
+        <w:rPr>
+          <w:i/>
+          <w:sz w:val="18"/>
+        </w:rPr>
+        <w:t>Hình minh họa — O4 — Screen flow trên Figma</w:t>
+      </w:r>
+    </w:p>
+    <w:p>
+      <w:pPr>
+        <w:pStyle w:val="Heading3"/>
+      </w:pPr>
+      <w:r>
+        <w:t>O5 — Danh sách màn hình (Basic Design xlsx)</w:t>
       </w:r>
     </w:p>
     <w:p>
@@ -1785,7 +2010,7 @@
         <w:drawing>
           <wp:inline xmlns:a="http://schemas.openxmlformats.org/drawingml/2006/main" xmlns:pic="http://schemas.openxmlformats.org/drawingml/2006/picture">
             <wp:extent cx="5400000" cy="2305866"/>
-            <wp:docPr id="11" name="Picture 11"/>
+            <wp:docPr id="14" name="Picture 14"/>
             <wp:cNvGraphicFramePr>
               <a:graphicFrameLocks noChangeAspect="1"/>
             </wp:cNvGraphicFramePr>
@@ -1797,7 +2022,7 @@
                     <pic:cNvPicPr/>
                   </pic:nvPicPr>
                   <pic:blipFill>
-                    <a:blip r:embed="rId19"/>
+                    <a:blip r:embed="rId22"/>
                     <a:stretch>
                       <a:fillRect/>
                     </a:stretch>
@@ -1825,232 +2050,7 @@
           <w:i/>
           <w:sz w:val="18"/>
         </w:rPr>
-        <w:t>Hình minh họa — O2 — sheet Screen Index</w:t>
-      </w:r>
-    </w:p>
-    <w:p>
-      <w:pPr>
-        <w:pStyle w:val="Heading3"/>
-      </w:pPr>
-      <w:r>
-        <w:t>O3 — API Documentation (xlsx)</w:t>
-      </w:r>
-    </w:p>
-    <w:p>
-      <w:pPr>
-        <w:pStyle w:val="ListBullet"/>
-      </w:pPr>
-      <w:r>
-        <w:t>Dùng để: tra mọi API / batch theo group — làm gì, method, request, response, màn nào gọi.</w:t>
-      </w:r>
-    </w:p>
-    <w:p>
-      <w:pPr>
-        <w:pStyle w:val="ListBullet"/>
-      </w:pPr>
-      <w:r>
-        <w:t>Mở: sheet 00_Index → bấm API ID để tới block chi tiết.</w:t>
-      </w:r>
-    </w:p>
-    <w:p>
-      <w:pPr>
-        <w:jc w:val="center"/>
-      </w:pPr>
-      <w:r>
-        <w:drawing>
-          <wp:inline xmlns:a="http://schemas.openxmlformats.org/drawingml/2006/main" xmlns:pic="http://schemas.openxmlformats.org/drawingml/2006/picture">
-            <wp:extent cx="5400000" cy="2304198"/>
-            <wp:docPr id="12" name="Picture 12"/>
-            <wp:cNvGraphicFramePr>
-              <a:graphicFrameLocks noChangeAspect="1"/>
-            </wp:cNvGraphicFramePr>
-            <a:graphic>
-              <a:graphicData uri="http://schemas.openxmlformats.org/drawingml/2006/picture">
-                <pic:pic>
-                  <pic:nvPicPr>
-                    <pic:cNvPr id="0" name="output_O2.png"/>
-                    <pic:cNvPicPr/>
-                  </pic:nvPicPr>
-                  <pic:blipFill>
-                    <a:blip r:embed="rId20"/>
-                    <a:stretch>
-                      <a:fillRect/>
-                    </a:stretch>
-                  </pic:blipFill>
-                  <pic:spPr>
-                    <a:xfrm>
-                      <a:off x="0" y="0"/>
-                      <a:ext cx="5400000" cy="2304198"/>
-                    </a:xfrm>
-                    <a:prstGeom prst="rect"/>
-                  </pic:spPr>
-                </pic:pic>
-              </a:graphicData>
-            </a:graphic>
-          </wp:inline>
-        </w:drawing>
-      </w:r>
-    </w:p>
-    <w:p>
-      <w:pPr>
-        <w:jc w:val="center"/>
-      </w:pPr>
-      <w:r>
-        <w:rPr>
-          <w:i/>
-          <w:sz w:val="18"/>
-        </w:rPr>
-        <w:t>Hình minh họa — O3 — sheet 00_Index</w:t>
-      </w:r>
-    </w:p>
-    <w:p>
-      <w:pPr>
-        <w:pStyle w:val="Heading3"/>
-      </w:pPr>
-      <w:r>
-        <w:t>O4 — Database Documentation (xlsx + ERD)</w:t>
-      </w:r>
-    </w:p>
-    <w:p>
-      <w:pPr>
-        <w:pStyle w:val="ListBullet"/>
-      </w:pPr>
-      <w:r>
-        <w:t>Dùng để: xem các bảng, quan hệ, từng cột (kiểu, format, giới hạn, mục đích).</w:t>
-      </w:r>
-    </w:p>
-    <w:p>
-      <w:pPr>
-        <w:pStyle w:val="ListBullet"/>
-      </w:pPr>
-      <w:r>
-        <w:t>Mở: sheet 00_Overview → 02_ERD (sơ đồ) → mỗi bảng 1 sheet T_…</w:t>
-      </w:r>
-    </w:p>
-    <w:p>
-      <w:pPr>
-        <w:jc w:val="center"/>
-      </w:pPr>
-      <w:r>
-        <w:drawing>
-          <wp:inline xmlns:a="http://schemas.openxmlformats.org/drawingml/2006/main" xmlns:pic="http://schemas.openxmlformats.org/drawingml/2006/picture">
-            <wp:extent cx="5400000" cy="2293608"/>
-            <wp:docPr id="13" name="Picture 13"/>
-            <wp:cNvGraphicFramePr>
-              <a:graphicFrameLocks noChangeAspect="1"/>
-            </wp:cNvGraphicFramePr>
-            <a:graphic>
-              <a:graphicData uri="http://schemas.openxmlformats.org/drawingml/2006/picture">
-                <pic:pic>
-                  <pic:nvPicPr>
-                    <pic:cNvPr id="0" name="output_O3.png"/>
-                    <pic:cNvPicPr/>
-                  </pic:nvPicPr>
-                  <pic:blipFill>
-                    <a:blip r:embed="rId21"/>
-                    <a:stretch>
-                      <a:fillRect/>
-                    </a:stretch>
-                  </pic:blipFill>
-                  <pic:spPr>
-                    <a:xfrm>
-                      <a:off x="0" y="0"/>
-                      <a:ext cx="5400000" cy="2293608"/>
-                    </a:xfrm>
-                    <a:prstGeom prst="rect"/>
-                  </pic:spPr>
-                </pic:pic>
-              </a:graphicData>
-            </a:graphic>
-          </wp:inline>
-        </w:drawing>
-      </w:r>
-    </w:p>
-    <w:p>
-      <w:pPr>
-        <w:jc w:val="center"/>
-      </w:pPr>
-      <w:r>
-        <w:rPr>
-          <w:i/>
-          <w:sz w:val="18"/>
-        </w:rPr>
-        <w:t>Hình minh họa — O4 — sheet 02_ERD</w:t>
-      </w:r>
-    </w:p>
-    <w:p>
-      <w:pPr>
-        <w:pStyle w:val="Heading3"/>
-      </w:pPr>
-      <w:r>
-        <w:t>O5 — Figma flow</w:t>
-      </w:r>
-    </w:p>
-    <w:p>
-      <w:pPr>
-        <w:pStyle w:val="ListBullet"/>
-      </w:pPr>
-      <w:r>
-        <w:t>Dùng để: xem Flow tổng quan + Screen flow (màn nào dẫn tới màn nào, nhánh lỗi / edge).</w:t>
-      </w:r>
-    </w:p>
-    <w:p>
-      <w:pPr>
-        <w:pStyle w:val="ListBullet"/>
-      </w:pPr>
-      <w:r>
-        <w:t>Mở: link trong 05_Figma/figma-links.md.</w:t>
-      </w:r>
-    </w:p>
-    <w:p>
-      <w:pPr>
-        <w:jc w:val="center"/>
-      </w:pPr>
-      <w:r>
-        <w:drawing>
-          <wp:inline xmlns:a="http://schemas.openxmlformats.org/drawingml/2006/main" xmlns:pic="http://schemas.openxmlformats.org/drawingml/2006/picture">
-            <wp:extent cx="5400000" cy="2843265"/>
-            <wp:docPr id="14" name="Picture 14"/>
-            <wp:cNvGraphicFramePr>
-              <a:graphicFrameLocks noChangeAspect="1"/>
-            </wp:cNvGraphicFramePr>
-            <a:graphic>
-              <a:graphicData uri="http://schemas.openxmlformats.org/drawingml/2006/picture">
-                <pic:pic>
-                  <pic:nvPicPr>
-                    <pic:cNvPr id="0" name="output_O5.png"/>
-                    <pic:cNvPicPr/>
-                  </pic:nvPicPr>
-                  <pic:blipFill>
-                    <a:blip r:embed="rId22"/>
-                    <a:stretch>
-                      <a:fillRect/>
-                    </a:stretch>
-                  </pic:blipFill>
-                  <pic:spPr>
-                    <a:xfrm>
-                      <a:off x="0" y="0"/>
-                      <a:ext cx="5400000" cy="2843265"/>
-                    </a:xfrm>
-                    <a:prstGeom prst="rect"/>
-                  </pic:spPr>
-                </pic:pic>
-              </a:graphicData>
-            </a:graphic>
-          </wp:inline>
-        </w:drawing>
-      </w:r>
-    </w:p>
-    <w:p>
-      <w:pPr>
-        <w:jc w:val="center"/>
-      </w:pPr>
-      <w:r>
-        <w:rPr>
-          <w:i/>
-          <w:sz w:val="18"/>
-        </w:rPr>
-        <w:t>Hình minh họa — O5 — Screen flow trên Figma</w:t>
+        <w:t>Hình minh họa — O5 — sheet Screen Index</w:t>
       </w:r>
     </w:p>
     <w:p>

</xml_diff>